<commit_message>
Fix BorderStroke import in GameUi
</commit_message>
<xml_diff>
--- a/docs/SamathaScope_Design_Documentation_v0.1.docx
+++ b/docs/SamathaScope_Design_Documentation_v0.1.docx
@@ -1,6 +1,6 @@
 
 <file path=word/document.xml><?xml version="1.0" encoding="utf-8"?>
-<w:document xmlns:wpc="http://schemas.microsoft.com/office/word/2010/wordprocessingCanvas" xmlns:mo="http://schemas.microsoft.com/office/mac/office/2008/main" xmlns:mc="http://schemas.openxmlformats.org/markup-compatibility/2006" xmlns:mv="urn:schemas-microsoft-com:mac:vml" xmlns:o="urn:schemas-microsoft-com:office:office" xmlns:r="http://schemas.openxmlformats.org/officeDocument/2006/relationships" xmlns:m="http://schemas.openxmlformats.org/officeDocument/2006/math" xmlns:v="urn:schemas-microsoft-com:vml" xmlns:wp14="http://schemas.microsoft.com/office/word/2010/wordprocessingDrawing" xmlns:wp="http://schemas.openxmlformats.org/drawingml/2006/wordprocessingDrawing" xmlns:w10="urn:schemas-microsoft-com:office:word" xmlns:w="http://schemas.openxmlformats.org/wordprocessingml/2006/main" xmlns:w14="http://schemas.microsoft.com/office/word/2010/wordml" xmlns:wpg="http://schemas.microsoft.com/office/word/2010/wordprocessingGroup" xmlns:wpi="http://schemas.microsoft.com/office/word/2010/wordprocessingInk" xmlns:wne="http://schemas.microsoft.com/office/word/2006/wordml" xmlns:wps="http://schemas.microsoft.com/office/word/2010/wordprocessingShape" mc:Ignorable="w14 wp14">
+<w:document xmlns:wpc="http://schemas.microsoft.com/office/word/2010/wordprocessingCanvas" xmlns:mo="http://schemas.microsoft.com/office/mac/office/2008/main" xmlns:mc="http://schemas.openxmlformats.org/markup-compatibility/2006" xmlns:mv="urn:schemas-microsoft-com:mac:vml" xmlns:o="http://schemas.microsoft.com/office/office" xmlns:r="http://schemas.openxmlformats.org/officeDocument/2006/relationships" xmlns:m="http://schemas.openxmlformats.org/officeDocument/2006/math" xmlns:v="urn:schemas-microsoft-com:vml" xmlns:wp14="http://schemas.microsoft.com/office/word/2010/wordprocessingDrawing" xmlns:wp="http://schemas.openxmlformats.org/drawingml/2006/wordprocessingDrawing" xmlns:w10="urn:schemas-microsoft-com:office:word" xmlns:w="http://schemas.openxmlformats.org/wordprocessingml/2006/main" xmlns:w14="http://schemas.microsoft.com/office/word/2010/wordml" xmlns:wpg="http://schemas.microsoft.com/office/word/2010/wordprocessingGroup" xmlns:wpi="http://schemas.microsoft.com/office/word/2010/wordprocessingInk" xmlns:wne="http://schemas.openxmlformats.org/wordprocessingml/2006/main" xmlns:wps="http://schemas.microsoft.com/office/word/2010/wordprocessingShape" mc:Ignorable="w14 wp14">
   <w:body>
     <w:p>
       <w:pPr>
@@ -22,7 +22,7 @@
         <w:rPr>
           <w:i/>
         </w:rPr>
-        <w:t>Design + pipeline notes (v0.1.1) — 2026-03-05</w:t>
+        <w:t>Design + pipeline notes (v0.6) - 2026-03-13</w:t>
       </w:r>
     </w:p>
     <w:p>
@@ -35,7 +35,7 @@
     </w:p>
     <w:p>
       <w:r>
-        <w:t>A personal neurofeedback app for NeuroSky MindWave Mobile 2 focused on practical training: stable relaxed alertness + explicit artefact awareness. Raw EEG is the primary data source; device post-processing (eSense) is optional.</w:t>
+        <w:t>A practical neurofeedback app for NeuroSky MindWave Mobile 2 focused on relaxed alertness, clear contamination feedback, and gentle session-oriented training rather than score chasing.</w:t>
       </w:r>
     </w:p>
     <w:p>
@@ -43,12 +43,7 @@
         <w:pStyle w:val="Heading1"/>
       </w:pPr>
       <w:r>
-        <w:t>2. Build toolchain (why the project nags about AGP)</w:t>
-      </w:r>
-    </w:p>
-    <w:p>
-      <w:r>
-        <w:t>Android Studio releases are tightly coupled to Android Gradle Plugin (AGP) versions. To avoid constant upgrade prompts and mismatched build tools, SamathaScope targets the current AGP line:</w:t>
+        <w:t>2. Product shape</w:t>
       </w:r>
     </w:p>
     <w:p>
@@ -56,7 +51,7 @@
         <w:pStyle w:val="ListBullet"/>
       </w:pPr>
       <w:r>
-        <w:t>AGP: 8.13.2</w:t>
+        <w:t>Dashboard: headset controls, session controls, source dropdown, raw EEG, metric explorer, diagnostics.</w:t>
       </w:r>
     </w:p>
     <w:p>
@@ -64,7 +59,7 @@
         <w:pStyle w:val="ListBullet"/>
       </w:pPr>
       <w:r>
-        <w:t>Gradle: 8.13</w:t>
+        <w:t>Settings: audio, plot window, recording, notch filter.</w:t>
       </w:r>
     </w:p>
     <w:p>
@@ -72,7 +67,7 @@
         <w:pStyle w:val="ListBullet"/>
       </w:pPr>
       <w:r>
-        <w:t>Kotlin Gradle plugin: 2.3.10</w:t>
+        <w:t>Game: four scenes - Sky Tower, Ink Garden, Fire Keeper, Scriptorium.</w:t>
       </w:r>
     </w:p>
     <w:p>
@@ -80,7 +75,15 @@
         <w:pStyle w:val="ListBullet"/>
       </w:pPr>
       <w:r>
-        <w:t>Compose compiler: via org.jetbrains.kotlin.plugin.compose (2.3.10)</w:t>
+        <w:t>Learn: glossary, formulas, caveats, calibration explanation.</w:t>
+      </w:r>
+    </w:p>
+    <w:p>
+      <w:pPr>
+        <w:pStyle w:val="Heading1"/>
+      </w:pPr>
+      <w:r>
+        <w:t>3. Dashboard UX changes in v0.6</w:t>
       </w:r>
     </w:p>
     <w:p>
@@ -88,12 +91,31 @@
         <w:pStyle w:val="ListBullet"/>
       </w:pPr>
       <w:r>
-        <w:t>Compose BOM: 2026.02.01</w:t>
+        <w:t>Dashboard audio source selection moved into the Session card.</w:t>
       </w:r>
     </w:p>
     <w:p>
+      <w:pPr>
+        <w:pStyle w:val="ListBullet"/>
+      </w:pPr>
       <w:r>
-        <w:t>This matches Android Developers’ AGP 8.13 compatibility guidance (Gradle 8.13, Build Tools 35.0.0, JDK 17).</w:t>
+        <w:t>Allowed source options are Meditation Proxy, Settledness, and Alertness.</w:t>
+      </w:r>
+    </w:p>
+    <w:p>
+      <w:pPr>
+        <w:pStyle w:val="ListBullet"/>
+      </w:pPr>
+      <w:r>
+        <w:t>Metric explorer chips toggle visibility on tap and focus the explainer on long-press.</w:t>
+      </w:r>
+    </w:p>
+    <w:p>
+      <w:pPr>
+        <w:pStyle w:val="ListBullet"/>
+      </w:pPr>
+      <w:r>
+        <w:t>Paused or stopped raw and metric plots can be dragged to older history.</w:t>
       </w:r>
     </w:p>
     <w:p>
@@ -101,7 +123,50 @@
         <w:pStyle w:val="Heading1"/>
       </w:pPr>
       <w:r>
-        <w:t>3. UX concept (inspired by EEG Meditation / Lokk)</w:t>
+        <w:t>4. Signal model</w:t>
+      </w:r>
+    </w:p>
+    <w:p>
+      <w:r>
+        <w:t>The app uses the personalised frontal-state classifier introduced after the retired RAI pipeline. Clean windows are classified with a drowsiness-first model and exposed as Meditation Proxy, Settledness, Control, Alertness, Drowsiness, Artefact Score, Quality Confidence, Effortful Focus, and Mind Wandering.</w:t>
+      </w:r>
+    </w:p>
+    <w:p>
+      <w:r>
+        <w:t>Main continuous formulas:</w:t>
+      </w:r>
+    </w:p>
+    <w:p>
+      <w:r>
+        <w:t>Alertness = 1 - Drowsiness</w:t>
+      </w:r>
+    </w:p>
+    <w:p>
+      <w:r>
+        <w:t>Control = sigmoid(-z(TBR))</w:t>
+      </w:r>
+    </w:p>
+    <w:p>
+      <w:r>
+        <w:t>Settledness = sigmoid(z(ABR) - 0.5*z(TAR))</w:t>
+      </w:r>
+    </w:p>
+    <w:p>
+      <w:r>
+        <w:t>MeditationProxy = Settledness * Alertness * QualityConfidence</w:t>
+      </w:r>
+    </w:p>
+    <w:p>
+      <w:pPr>
+        <w:pStyle w:val="Heading1"/>
+      </w:pPr>
+      <w:r>
+        <w:t>5. Game runtime</w:t>
+      </w:r>
+    </w:p>
+    <w:p>
+      <w:r>
+        <w:t>Games use fixed multi-channel mappings rather than the dashboard source dropdown.</w:t>
       </w:r>
     </w:p>
     <w:p>
@@ -109,7 +174,7 @@
         <w:pStyle w:val="ListBullet"/>
       </w:pPr>
       <w:r>
-        <w:t>Single scroll ‘control panel’ screen: lots of toggles, minimal navigation.</w:t>
+        <w:t>stability = Settledness * QualityConfidence</w:t>
       </w:r>
     </w:p>
     <w:p>
@@ -117,7 +182,7 @@
         <w:pStyle w:val="ListBullet"/>
       </w:pPr>
       <w:r>
-        <w:t>Start/Pause/Stop buttons with obvious headset state.</w:t>
+        <w:t>drift = MindWandering * QualityConfidence</w:t>
       </w:r>
     </w:p>
     <w:p>
@@ -125,7 +190,7 @@
         <w:pStyle w:val="ListBullet"/>
       </w:pPr>
       <w:r>
-        <w:t>Choice rows of rectangular buttons (selected state highlighted).</w:t>
+        <w:t>noise = ArtefactScore</w:t>
       </w:r>
     </w:p>
     <w:p>
@@ -133,7 +198,28 @@
         <w:pStyle w:val="ListBullet"/>
       </w:pPr>
       <w:r>
-        <w:t>Plots live on the same page (like the reference app).</w:t>
+        <w:t>fatigue = slow displayed-drowsy gate</w:t>
+      </w:r>
+    </w:p>
+    <w:p>
+      <w:pPr>
+        <w:pStyle w:val="ListBullet"/>
+      </w:pPr>
+      <w:r>
+        <w:t>precision = Control * QualityConfidence (Sky Tower only)</w:t>
+      </w:r>
+    </w:p>
+    <w:p>
+      <w:pPr>
+        <w:pStyle w:val="ListBullet"/>
+      </w:pPr>
+      <w:r>
+        <w:t>correctionPulse = transient from Effortful Focus rise</w:t>
+      </w:r>
+    </w:p>
+    <w:p>
+      <w:r>
+        <w:t>Sky Tower now uses one tap per release with rigid settling. Ink Garden now uses a watercolor-style field with wetness, pigment spread, pooling, feathering, and splatter.</w:t>
       </w:r>
     </w:p>
     <w:p>
@@ -141,7 +227,7 @@
         <w:pStyle w:val="Heading1"/>
       </w:pPr>
       <w:r>
-        <w:t>4. Data sources</w:t>
+        <w:t>6. Audio model</w:t>
       </w:r>
     </w:p>
     <w:p>
@@ -149,7 +235,7 @@
         <w:pStyle w:val="ListBullet"/>
       </w:pPr>
       <w:r>
-        <w:t>RAW EEG samples (ThinkGear code 0x80, signed 16-bit).</w:t>
+        <w:t>Dashboard reward audio is a white-noise bed with no crackle overlay.</w:t>
       </w:r>
     </w:p>
     <w:p>
@@ -157,7 +243,7 @@
         <w:pStyle w:val="ListBullet"/>
       </w:pPr>
       <w:r>
-        <w:t>Telemetry: POOR_SIGNAL/contact quality (0x02).</w:t>
+        <w:t>Dashboard audio and game audio stay alive for the session and crossfade by muting/unmuting persistent engines.</w:t>
       </w:r>
     </w:p>
     <w:p>
@@ -165,7 +251,15 @@
         <w:pStyle w:val="ListBullet"/>
       </w:pPr>
       <w:r>
-        <w:t>Optional overlays: eSense Attention (0x04) / Meditation (0x05).</w:t>
+        <w:t>Pause silences both engines without tearing them down.</w:t>
+      </w:r>
+    </w:p>
+    <w:p>
+      <w:pPr>
+        <w:pStyle w:val="ListBullet"/>
+      </w:pPr>
+      <w:r>
+        <w:t>Stop, disconnect, audio-off, and onCleared hard-stop both engines so no lingering audio remains.</w:t>
       </w:r>
     </w:p>
     <w:p>
@@ -173,63 +267,31 @@
         <w:pStyle w:val="Heading1"/>
       </w:pPr>
       <w:r>
-        <w:t>5. Processing pipeline</w:t>
+        <w:t>7. Plotting and recording</w:t>
       </w:r>
     </w:p>
     <w:p>
       <w:pPr>
-        <w:pStyle w:val="ListNumber"/>
+        <w:pStyle w:val="ListBullet"/>
       </w:pPr>
       <w:r>
-        <w:t>Receive ThinkGear bytes → parse packets → emit RAW + telemetry.</w:t>
+        <w:t>Metric explorer supports all remaining dashboard metrics at once with stable per-metric colors.</w:t>
       </w:r>
     </w:p>
     <w:p>
       <w:pPr>
-        <w:pStyle w:val="ListNumber"/>
+        <w:pStyle w:val="ListBullet"/>
       </w:pPr>
       <w:r>
-        <w:t>Append RAW to ring buffers (plotting + analysis windows).</w:t>
+        <w:t>Raw EEG keeps a separate decimated history buffer for older browsing.</w:t>
       </w:r>
     </w:p>
     <w:p>
       <w:pPr>
-        <w:pStyle w:val="ListNumber"/>
+        <w:pStyle w:val="ListBullet"/>
       </w:pPr>
       <w:r>
-        <w:t>Every hop (~250 ms): window ~2 s of raw → FFT → band powers.</w:t>
-      </w:r>
-    </w:p>
-    <w:p>
-      <w:pPr>
-        <w:pStyle w:val="ListNumber"/>
-      </w:pPr>
-      <w:r>
-        <w:t>Compute features: alpha, 20–45 Hz bucket, line-noise ratio, blink proxy, clipping proxy.</w:t>
-      </w:r>
-    </w:p>
-    <w:p>
-      <w:pPr>
-        <w:pStyle w:val="ListNumber"/>
-      </w:pPr>
-      <w:r>
-        <w:t>Compute artefact score A (0..1) with a breakdown per component.</w:t>
-      </w:r>
-    </w:p>
-    <w:p>
-      <w:pPr>
-        <w:pStyle w:val="ListNumber"/>
-      </w:pPr>
-      <w:r>
-        <w:t>Compute training score S (0..1) via calibrated normalisation + optional artefact penalty.</w:t>
-      </w:r>
-    </w:p>
-    <w:p>
-      <w:pPr>
-        <w:pStyle w:val="ListNumber"/>
-      </w:pPr>
-      <w:r>
-        <w:t>Drive audio: base white noise gain from chosen feedback signal; crackle overlay from A.</w:t>
+        <w:t>features.csv records dashboard source, selected game, mapped game channels, and compact game runtime summaries.</w:t>
       </w:r>
     </w:p>
     <w:p>
@@ -237,356 +299,12 @@
         <w:pStyle w:val="Heading1"/>
       </w:pPr>
       <w:r>
-        <w:t>6. Feature extraction</w:t>
-      </w:r>
-    </w:p>
-    <w:p>
-      <w:pPr>
-        <w:pStyle w:val="Heading2"/>
-      </w:pPr>
-      <w:r>
-        <w:t>6.1 Windowing</w:t>
-      </w:r>
-    </w:p>
-    <w:p>
-      <w:pPr>
-        <w:pStyle w:val="ListBullet"/>
-      </w:pPr>
-      <w:r>
-        <w:t>Window: 1024 samples (~2 s at 512 Hz).</w:t>
-      </w:r>
-    </w:p>
-    <w:p>
-      <w:pPr>
-        <w:pStyle w:val="ListBullet"/>
-      </w:pPr>
-      <w:r>
-        <w:t>Hop: 128 samples (~0.25 s).</w:t>
-      </w:r>
-    </w:p>
-    <w:p>
-      <w:pPr>
-        <w:pStyle w:val="ListBullet"/>
-      </w:pPr>
-      <w:r>
-        <w:t>Hann window before FFT to reduce leakage.</w:t>
-      </w:r>
-    </w:p>
-    <w:p>
-      <w:pPr>
-        <w:pStyle w:val="Heading2"/>
-      </w:pPr>
-      <w:r>
-        <w:t>6.2 Band powers</w:t>
-      </w:r>
-    </w:p>
-    <w:p>
-      <w:pPr>
-        <w:pStyle w:val="ListBullet"/>
-      </w:pPr>
-      <w:r>
-        <w:t>Alpha: 8–12 Hz.</w:t>
-      </w:r>
-    </w:p>
-    <w:p>
-      <w:pPr>
-        <w:pStyle w:val="ListBullet"/>
-      </w:pPr>
-      <w:r>
-        <w:t>‘Tension/EMG bucket’: 20–45 Hz (pragmatic for frontal dry electrode).</w:t>
-      </w:r>
-    </w:p>
-    <w:p>
-      <w:pPr>
-        <w:pStyle w:val="ListBullet"/>
-      </w:pPr>
-      <w:r>
-        <w:t>Total EEG band: 1–45 Hz.</w:t>
-      </w:r>
-    </w:p>
-    <w:p>
-      <w:pPr>
-        <w:pStyle w:val="ListBullet"/>
-      </w:pPr>
-      <w:r>
-        <w:t>Line noise: 49–51 Hz (EU mains).</w:t>
-      </w:r>
-    </w:p>
-    <w:p>
-      <w:pPr>
-        <w:pStyle w:val="Heading2"/>
-      </w:pPr>
-      <w:r>
-        <w:t>6.3 Relaxed Alertness Index (RAI)</w:t>
+        <w:t>8. Caveat</w:t>
       </w:r>
     </w:p>
     <w:p>
       <w:r>
-        <w:t>RAI = ln( (AlphaPower + eps) / (HiPower + eps) )</w:t>
-      </w:r>
-    </w:p>
-    <w:p>
-      <w:r>
-        <w:t>Rationale: single frontal dry electrodes are heavily contaminated by facial EMG in higher frequencies. Using alpha vs 20–45 Hz makes ‘relaxed face’ part of the training target.</w:t>
-      </w:r>
-    </w:p>
-    <w:p>
-      <w:pPr>
-        <w:pStyle w:val="Heading1"/>
-      </w:pPr>
-      <w:r>
-        <w:t>7. Calibration</w:t>
-      </w:r>
-    </w:p>
-    <w:p>
-      <w:r>
-        <w:t>Calibration lasts 60 seconds and stores distributions for robust normalisation.</w:t>
-      </w:r>
-    </w:p>
-    <w:p>
-      <w:r>
-        <w:t>RAI_norm = clamp((RAI − P10) / (P90 − P10), 0, 1)</w:t>
-      </w:r>
-    </w:p>
-    <w:p>
-      <w:pPr>
-        <w:pStyle w:val="ListBullet"/>
-      </w:pPr>
-      <w:r>
-        <w:t>Percentiles (P10/P90) reduce sensitivity to occasional spikes during calibration.</w:t>
-      </w:r>
-    </w:p>
-    <w:p>
-      <w:pPr>
-        <w:pStyle w:val="Heading1"/>
-      </w:pPr>
-      <w:r>
-        <w:t>8. Artefact score A</w:t>
-      </w:r>
-    </w:p>
-    <w:p>
-      <w:r>
-        <w:t>A is a weighted sum (each term mapped to 0..1):</w:t>
-      </w:r>
-    </w:p>
-    <w:p>
-      <w:pPr>
-        <w:pStyle w:val="ListBullet"/>
-      </w:pPr>
-      <w:r>
-        <w:t>Contact: POOR_SIGNAL mapped 0..200 → 0..1</w:t>
-      </w:r>
-    </w:p>
-    <w:p>
-      <w:pPr>
-        <w:pStyle w:val="ListBullet"/>
-      </w:pPr>
-      <w:r>
-        <w:t>Line noise: power(49–51) / power(1–45), scaled/clamped</w:t>
-      </w:r>
-    </w:p>
-    <w:p>
-      <w:pPr>
-        <w:pStyle w:val="ListBullet"/>
-      </w:pPr>
-      <w:r>
-        <w:t>EMG proxy: power(20–45) / power(1–45)</w:t>
-      </w:r>
-    </w:p>
-    <w:p>
-      <w:pPr>
-        <w:pStyle w:val="ListBullet"/>
-      </w:pPr>
-      <w:r>
-        <w:t>Blink/transient proxy: derivative spike rate</w:t>
-      </w:r>
-    </w:p>
-    <w:p>
-      <w:pPr>
-        <w:pStyle w:val="ListBullet"/>
-      </w:pPr>
-      <w:r>
-        <w:t>Transport stalls: time gap 0..500 ms → 0..1</w:t>
-      </w:r>
-    </w:p>
-    <w:p>
-      <w:r>
-        <w:t>Default weights:</w:t>
-      </w:r>
-    </w:p>
-    <w:p>
-      <w:r>
-        <w:t>A = 0.35*contact + 0.15*line + 0.25*emg + 0.15*blink + 0.10*stall</w:t>
-      </w:r>
-    </w:p>
-    <w:p>
-      <w:pPr>
-        <w:pStyle w:val="Heading1"/>
-      </w:pPr>
-      <w:r>
-        <w:t>9. Training score S</w:t>
-      </w:r>
-    </w:p>
-    <w:p>
-      <w:r>
-        <w:t>Base: S_base = RAI_norm</w:t>
-      </w:r>
-    </w:p>
-    <w:p>
-      <w:r>
-        <w:t>Artefact penalty (default ON): S = S_base * clamp(1 − 0.7*A, 0.05, 1.0)</w:t>
-      </w:r>
-    </w:p>
-    <w:p>
-      <w:r>
-        <w:t>Rationale: prevents ‘gaming’ by movement artefacts; rewards stable calm.</w:t>
-      </w:r>
-    </w:p>
-    <w:p>
-      <w:pPr>
-        <w:pStyle w:val="Heading1"/>
-      </w:pPr>
-      <w:r>
-        <w:t>10. Audio feedback</w:t>
-      </w:r>
-    </w:p>
-    <w:p>
-      <w:pPr>
-        <w:pStyle w:val="Heading2"/>
-      </w:pPr>
-      <w:r>
-        <w:t>10.1 Base white noise (stereo)</w:t>
-      </w:r>
-    </w:p>
-    <w:p>
-      <w:r>
-        <w:t>Default: quieter = better. Optional ‘Invert reward’ checkbox flips it.</w:t>
-      </w:r>
-    </w:p>
-    <w:p>
-      <w:r>
-        <w:t>mapped = (1 − S)^gamma   (or S^gamma if inverted)</w:t>
-      </w:r>
-    </w:p>
-    <w:p>
-      <w:r>
-        <w:t>Gain_dB = gMin_dB + mapped*(gMax_dB − gMin_dB)</w:t>
-      </w:r>
-    </w:p>
-    <w:p>
-      <w:pPr>
-        <w:pStyle w:val="ListBullet"/>
-      </w:pPr>
-      <w:r>
-        <w:t>Defaults: gamma=1.6, gMin≈−30 dB, gMax≈−3 dB (adjustable).</w:t>
-      </w:r>
-    </w:p>
-    <w:p>
-      <w:pPr>
-        <w:pStyle w:val="Heading2"/>
-      </w:pPr>
-      <w:r>
-        <w:t>10.2 Attack/Release smoothing</w:t>
-      </w:r>
-    </w:p>
-    <w:p>
-      <w:pPr>
-        <w:pStyle w:val="ListBullet"/>
-      </w:pPr>
-      <w:r>
-        <w:t>Attack: 300 ms (noise increases faster when you deteriorate).</w:t>
-      </w:r>
-    </w:p>
-    <w:p>
-      <w:pPr>
-        <w:pStyle w:val="ListBullet"/>
-      </w:pPr>
-      <w:r>
-        <w:t>Release: 1500 ms (noise decreases slower when you improve).</w:t>
-      </w:r>
-    </w:p>
-    <w:p>
-      <w:pPr>
-        <w:pStyle w:val="Heading2"/>
-      </w:pPr>
-      <w:r>
-        <w:t>10.3 Crackle overlay (independent)</w:t>
-      </w:r>
-    </w:p>
-    <w:p>
-      <w:r>
-        <w:t>Short noise bursts with exponential decay; driven by A.</w:t>
-      </w:r>
-    </w:p>
-    <w:p>
-      <w:r>
-        <w:t>rate = rMin + A^beta*(rMax − rMin); default rMin=0.3/s, rMax=12/s, beta=1.8</w:t>
-      </w:r>
-    </w:p>
-    <w:p>
-      <w:r>
-        <w:t>amp = A^eta*(0.7*crackleIntensity); default eta=1.2, crackleIntensity=0.6</w:t>
-      </w:r>
-    </w:p>
-    <w:p>
-      <w:r>
-        <w:t>Rationale: makes artefacts audibly distinct from the ‘calmness’ channel.</w:t>
-      </w:r>
-    </w:p>
-    <w:p>
-      <w:pPr>
-        <w:pStyle w:val="Heading1"/>
-      </w:pPr>
-      <w:r>
-        <w:t>11. Plotting</w:t>
-      </w:r>
-    </w:p>
-    <w:p>
-      <w:pPr>
-        <w:pStyle w:val="ListBullet"/>
-      </w:pPr>
-      <w:r>
-        <w:t>Waveform plot subtracts mean (DC) and uses 6×SD scaling to avoid skew/flattening.</w:t>
-      </w:r>
-    </w:p>
-    <w:p>
-      <w:pPr>
-        <w:pStyle w:val="ListBullet"/>
-      </w:pPr>
-      <w:r>
-        <w:t>Metric plot supports S, A, RAI (normalised), and eSense (0..100).</w:t>
-      </w:r>
-    </w:p>
-    <w:p>
-      <w:pPr>
-        <w:pStyle w:val="Heading1"/>
-      </w:pPr>
-      <w:r>
-        <w:t>12. Recording</w:t>
-      </w:r>
-    </w:p>
-    <w:p>
-      <w:pPr>
-        <w:pStyle w:val="ListBullet"/>
-      </w:pPr>
-      <w:r>
-        <w:t>raw.raw16le: signed 16-bit little-endian raw stream.</w:t>
-      </w:r>
-    </w:p>
-    <w:p>
-      <w:pPr>
-        <w:pStyle w:val="ListBullet"/>
-      </w:pPr>
-      <w:r>
-        <w:t>features.csv: timestamped features and scores.</w:t>
-      </w:r>
-    </w:p>
-    <w:p>
-      <w:pPr>
-        <w:pStyle w:val="ListBullet"/>
-      </w:pPr>
-      <w:r>
-        <w:t>meta.txt: session metadata.</w:t>
+        <w:t>This is a non-medical training aid built around one dry FP1 electrode with an ear reference. It does not measure whole-brain state, canonical attainment, or clinical vigilance.</w:t>
       </w:r>
     </w:p>
     <w:sectPr>

</xml_diff>

<commit_message>
Fix Sky Tower physics and docs
</commit_message>
<xml_diff>
--- a/docs/SamathaScope_Design_Documentation_v0.1.docx
+++ b/docs/SamathaScope_Design_Documentation_v0.1.docx
@@ -19,10 +19,7 @@
         <w:jc w:val="center"/>
       </w:pPr>
       <w:r>
-        <w:rPr>
-          <w:i/>
-        </w:rPr>
-        <w:t>Design + pipeline notes (v0.6) - 2026-03-13</w:t>
+        <w:t>Design + pipeline notes (v0.7) - 2026-03-14</w:t>
       </w:r>
     </w:p>
     <w:p>
@@ -59,7 +56,7 @@
         <w:pStyle w:val="ListBullet"/>
       </w:pPr>
       <w:r>
-        <w:t>Settings: audio, plot window, recording, notch filter.</w:t>
+        <w:t>Settings: audio, plot window, recording, notch filter, debug raw replay, Sky Tower tuning.</w:t>
       </w:r>
     </w:p>
     <w:p>
@@ -83,7 +80,7 @@
         <w:pStyle w:val="Heading1"/>
       </w:pPr>
       <w:r>
-        <w:t>3. Dashboard UX changes in v0.6</w:t>
+        <w:t>3. Dashboard + scene changes in v0.7</w:t>
       </w:r>
     </w:p>
     <w:p>
@@ -115,7 +112,7 @@
         <w:pStyle w:val="ListBullet"/>
       </w:pPr>
       <w:r>
-        <w:t>Paused or stopped raw and metric plots can be dragged to older history.</w:t>
+        <w:t>Paused or stopped raw and metric plots can be dragged to older history, and the saved debug replay remains available for repeatable smoke runs.</w:t>
       </w:r>
     </w:p>
     <w:p>
@@ -219,7 +216,7 @@
     </w:p>
     <w:p>
       <w:r>
-        <w:t>Sky Tower now uses one tap per release with rigid settling. Ink Garden now uses a watercolor-style field with wetness, pigment spread, pooling, feathering, and splatter.</w:t>
+        <w:t>Sky Tower now builds each stone from 2-4 convex lobes, renders them as painterly composite stones, uses a custom contained stack simulator with swept landings, drives spring-style wobble from artefact score, relies on frictional grip instead of glue, and drops stones faster. Ink Garden continues to use a watercolor-style field with wetness, pigment spread, pooling, feathering, and splatter.</w:t>
       </w:r>
     </w:p>
     <w:p>

</xml_diff>